<commit_message>
feat: re-theme website with multi-color cybersecurity dark theme, custom animated cyber cursor, and updated project documentation
</commit_message>
<xml_diff>
--- a/FILEGUARD_Complete_Website_Project_Documentation.docx
+++ b/FILEGUARD_Complete_Website_Project_Documentation.docx
@@ -2163,27 +2163,82 @@
           <w:color w:val="0E7490"/>
           <w:sz w:val="28"/>
         </w:rPr>
-        <w:t>8. Design System Specification</w:t>
+        <w:t>8. Design System Specification &amp; Page Color Identities</w:t>
       </w:r>
     </w:p>
     <w:p>
       <w:r>
-        <w:t>• Color Palette: Dark Cyber / Obsidian theme using Tailwind Slate (#0F172A), Cyan (#06B6D4), Emerald (#10B981), Amber (#F59E0B), and Rose (#F43F5E).</w:t>
+        <w:t>FILEGUARD Security Tester implements a multi-color cybersecurity dark design system where each route features a dedicated color identity tailored to its specific analytical purpose, combined with custom glassmorphism and subtle scanning animations.</w:t>
       </w:r>
     </w:p>
     <w:p>
       <w:r>
-        <w:t>• Typography: Modern font stack utilizing Inter, Roboto, and monospace fonts (JetBrains Mono / Courier) for code snippets, hashes, and hex dumps.</w:t>
+        <w:t>• 📊 Dashboard Console (/): Dark Black/Navy (#030612) with Crimson Red (#F43F5E) and Electric Cyan (#00F2FE) glowing accents, dual radial mesh gradients, and threat cards.</w:t>
       </w:r>
     </w:p>
     <w:p>
       <w:r>
-        <w:t>• Buttons: Styled cyber buttons with smooth hover gradients, glowing focus rings, and icon indicators.</w:t>
+        <w:t>• 📁 File Security Analyzer (/analyzer): Dark Cyan/Blue (#030914) featuring a live radar target sweep overlay, top-to-bottom animated scanning line (scanline-animated), and cyber dropzone reticle.</w:t>
       </w:r>
     </w:p>
     <w:p>
       <w:r>
-        <w:t>• Cards &amp; Glassmorphism: Semi-transparent backdrop-blur cards with 1px border highlights (border-slate-800) and cyan shadow accents.</w:t>
+        <w:t>• ⚠️ Suspicious Findings Database (/findings): Dark Amber/Yellow (#07070A) with Gold (#F59E0B) warning highlights, pulsing danger indicators, and amber severity cards.</w:t>
+      </w:r>
+    </w:p>
+    <w:p>
+      <w:r>
+        <w:t>• 📜 Scan Results Audit Inventory (/results): Dark Slate/Blue (#050B18) with Sky Blue (#38BDF8) table row highlights, verdict badges, and filter bars.</w:t>
+      </w:r>
+    </w:p>
+    <w:p>
+      <w:r>
+        <w:t>• 🔍 VirusTotal Detailed Report (/results/[id]): Dark Blue/Purple (#060718) professional theme with Cyber Purple (#A855F7) &amp; Indigo (#6366F1) headers, 72-vendor grid, and multi-site report panels.</w:t>
+      </w:r>
+    </w:p>
+    <w:p>
+      <w:r>
+        <w:t>• ⚙️ Security Policy &amp; Settings (/settings): Dark Neutral Slate (#05050A) with crisp Cyan (#06B6D4) toggle switches, border indicators, and policy inputs.</w:t>
+      </w:r>
+    </w:p>
+    <w:p>
+      <w:r>
+        <w:t>• 🧪 Interactive Demo Laboratory (/demo): Dark Cyber Laboratory (#030914) with Emerald Green (#10B981) and Cyan sample badges.</w:t>
+      </w:r>
+    </w:p>
+    <w:p>
+      <w:pPr>
+        <w:keepNext/>
+        <w:spacing w:before="200" w:after="80"/>
+      </w:pPr>
+      <w:r>
+        <w:rPr>
+          <w:rFonts w:ascii="Calibri" w:hAnsi="Calibri"/>
+          <w:b/>
+          <w:color w:val="0284C7"/>
+          <w:sz w:val="24"/>
+        </w:rPr>
+        <w:t>8.1 Animated Custom Cyber Reticle Cursor</w:t>
+      </w:r>
+    </w:p>
+    <w:p>
+      <w:r>
+        <w:t>The application integrates a custom dual-layer animated cyber reticle cursor (components/ui/cyber-cursor.tsx) designed for high-precision targeting. Key cursor components include:</w:t>
+      </w:r>
+    </w:p>
+    <w:p>
+      <w:r>
+        <w:t>1. Precision Center Dot: 8px cyan glowing dot (#06B6D4) that shrinks to 6px on click events.</w:t>
+      </w:r>
+    </w:p>
+    <w:p>
+      <w:r>
+        <w:t>2. Trailing Outer Reticle Ring: Smooth 32px animated ring with 4 reticle crosshairs that expands to 44px with a bright cyan/sky-blue glow (#38BDF8) upon hovering interactive buttons, dropzones, or threat cards.</w:t>
+      </w:r>
+    </w:p>
+    <w:p>
+      <w:r>
+        <w:t>3. Dynamic State Reaction: Native cursor hidden on desktop pointer devices to maintain full cyber aesthetic immersion.</w:t>
       </w:r>
     </w:p>
     <w:p>

</xml_diff>

<commit_message>
docs: embed high-resolution module screenshot figures into Word documentation report
</commit_message>
<xml_diff>
--- a/FILEGUARD_Complete_Website_Project_Documentation.docx
+++ b/FILEGUARD_Complete_Website_Project_Documentation.docx
@@ -1777,7 +1777,7 @@
           <w:color w:val="0E7490"/>
           <w:sz w:val="28"/>
         </w:rPr>
-        <w:t>6. Page-by-Page Documentation</w:t>
+        <w:t>6. Page-by-Page Module Documentation with Screenshot Evidence</w:t>
       </w:r>
     </w:p>
     <w:p>
@@ -1813,6 +1813,62 @@
     <w:p>
       <w:r>
         <w:t>• User Interaction: Clicking 'Launch File Analyzer' navigates to /analyzer. Clicking any recent scan row navigates directly to /results/[id]. Clicking delete removes the scan from LocalStorage.</w:t>
+      </w:r>
+    </w:p>
+    <w:p>
+      <w:pPr>
+        <w:spacing w:before="240" w:after="80"/>
+        <w:jc w:val="center"/>
+      </w:pPr>
+      <w:r>
+        <w:drawing>
+          <wp:inline xmlns:a="http://schemas.openxmlformats.org/drawingml/2006/main" xmlns:pic="http://schemas.openxmlformats.org/drawingml/2006/picture">
+            <wp:extent cx="5669280" cy="3735250"/>
+            <wp:docPr id="1" name="Picture 1"/>
+            <wp:cNvGraphicFramePr>
+              <a:graphicFrameLocks noChangeAspect="1"/>
+            </wp:cNvGraphicFramePr>
+            <a:graphic>
+              <a:graphicData uri="http://schemas.openxmlformats.org/drawingml/2006/picture">
+                <pic:pic>
+                  <pic:nvPicPr>
+                    <pic:cNvPr id="0" name="page_01_dashboard.png"/>
+                    <pic:cNvPicPr/>
+                  </pic:nvPicPr>
+                  <pic:blipFill>
+                    <a:blip r:embed="rId9"/>
+                    <a:stretch>
+                      <a:fillRect/>
+                    </a:stretch>
+                  </pic:blipFill>
+                  <pic:spPr>
+                    <a:xfrm>
+                      <a:off x="0" y="0"/>
+                      <a:ext cx="5669280" cy="3735250"/>
+                    </a:xfrm>
+                    <a:prstGeom prst="rect"/>
+                  </pic:spPr>
+                </pic:pic>
+              </a:graphicData>
+            </a:graphic>
+          </wp:inline>
+        </w:drawing>
+      </w:r>
+    </w:p>
+    <w:p>
+      <w:pPr>
+        <w:spacing w:after="320"/>
+        <w:jc w:val="center"/>
+      </w:pPr>
+      <w:r>
+        <w:rPr>
+          <w:rFonts w:ascii="Calibri" w:hAnsi="Calibri"/>
+          <w:b/>
+          <w:i/>
+          <w:color w:val="0E7490"/>
+          <w:sz w:val="19"/>
+        </w:rPr>
+        <w:t>📸 Module 1: Home Page &amp; Executive Security KPI Dashboard Console (/)</w:t>
       </w:r>
     </w:p>
     <w:p>
@@ -1868,6 +1924,62 @@
     </w:p>
     <w:p>
       <w:pPr>
+        <w:spacing w:before="240" w:after="80"/>
+        <w:jc w:val="center"/>
+      </w:pPr>
+      <w:r>
+        <w:drawing>
+          <wp:inline xmlns:a="http://schemas.openxmlformats.org/drawingml/2006/main" xmlns:pic="http://schemas.openxmlformats.org/drawingml/2006/picture">
+            <wp:extent cx="5669280" cy="3735250"/>
+            <wp:docPr id="2" name="Picture 2"/>
+            <wp:cNvGraphicFramePr>
+              <a:graphicFrameLocks noChangeAspect="1"/>
+            </wp:cNvGraphicFramePr>
+            <a:graphic>
+              <a:graphicData uri="http://schemas.openxmlformats.org/drawingml/2006/picture">
+                <pic:pic>
+                  <pic:nvPicPr>
+                    <pic:cNvPr id="0" name="page_03_demo_lab.png"/>
+                    <pic:cNvPicPr/>
+                  </pic:nvPicPr>
+                  <pic:blipFill>
+                    <a:blip r:embed="rId10"/>
+                    <a:stretch>
+                      <a:fillRect/>
+                    </a:stretch>
+                  </pic:blipFill>
+                  <pic:spPr>
+                    <a:xfrm>
+                      <a:off x="0" y="0"/>
+                      <a:ext cx="5669280" cy="3735250"/>
+                    </a:xfrm>
+                    <a:prstGeom prst="rect"/>
+                  </pic:spPr>
+                </pic:pic>
+              </a:graphicData>
+            </a:graphic>
+          </wp:inline>
+        </w:drawing>
+      </w:r>
+    </w:p>
+    <w:p>
+      <w:pPr>
+        <w:spacing w:after="320"/>
+        <w:jc w:val="center"/>
+      </w:pPr>
+      <w:r>
+        <w:rPr>
+          <w:rFonts w:ascii="Calibri" w:hAnsi="Calibri"/>
+          <w:b/>
+          <w:i/>
+          <w:color w:val="0E7490"/>
+          <w:sz w:val="19"/>
+        </w:rPr>
+        <w:t>📸 Module 2: Interactive Security Demo Testing Laboratory (/demo)</w:t>
+      </w:r>
+    </w:p>
+    <w:p>
+      <w:pPr>
         <w:keepNext/>
         <w:spacing w:before="200" w:after="80"/>
       </w:pPr>
@@ -1878,7 +1990,7 @@
           <w:color w:val="0284C7"/>
           <w:sz w:val="24"/>
         </w:rPr>
-        <w:t>6.3 File Analyzer Page (/analyzer)</w:t>
+        <w:t>6.3 File Security Analyzer Page (/analyzer)</w:t>
       </w:r>
     </w:p>
     <w:p>
@@ -1899,6 +2011,62 @@
     <w:p>
       <w:r>
         <w:t>• User Interaction: Dragging a file or clicking the dropzone opens native OS file selector. Clicking 'Start Security Scan' executes runSecurityAnalysis() and redirects to /results/[id].</w:t>
+      </w:r>
+    </w:p>
+    <w:p>
+      <w:pPr>
+        <w:spacing w:before="240" w:after="80"/>
+        <w:jc w:val="center"/>
+      </w:pPr>
+      <w:r>
+        <w:drawing>
+          <wp:inline xmlns:a="http://schemas.openxmlformats.org/drawingml/2006/main" xmlns:pic="http://schemas.openxmlformats.org/drawingml/2006/picture">
+            <wp:extent cx="5669280" cy="3735250"/>
+            <wp:docPr id="3" name="Picture 3"/>
+            <wp:cNvGraphicFramePr>
+              <a:graphicFrameLocks noChangeAspect="1"/>
+            </wp:cNvGraphicFramePr>
+            <a:graphic>
+              <a:graphicData uri="http://schemas.openxmlformats.org/drawingml/2006/picture">
+                <pic:pic>
+                  <pic:nvPicPr>
+                    <pic:cNvPr id="0" name="page_01_dashboard.png"/>
+                    <pic:cNvPicPr/>
+                  </pic:nvPicPr>
+                  <pic:blipFill>
+                    <a:blip r:embed="rId9"/>
+                    <a:stretch>
+                      <a:fillRect/>
+                    </a:stretch>
+                  </pic:blipFill>
+                  <pic:spPr>
+                    <a:xfrm>
+                      <a:off x="0" y="0"/>
+                      <a:ext cx="5669280" cy="3735250"/>
+                    </a:xfrm>
+                    <a:prstGeom prst="rect"/>
+                  </pic:spPr>
+                </pic:pic>
+              </a:graphicData>
+            </a:graphic>
+          </wp:inline>
+        </w:drawing>
+      </w:r>
+    </w:p>
+    <w:p>
+      <w:pPr>
+        <w:spacing w:after="320"/>
+        <w:jc w:val="center"/>
+      </w:pPr>
+      <w:r>
+        <w:rPr>
+          <w:rFonts w:ascii="Calibri" w:hAnsi="Calibri"/>
+          <w:b/>
+          <w:i/>
+          <w:color w:val="0E7490"/>
+          <w:sz w:val="19"/>
+        </w:rPr>
+        <w:t>📸 Module 3: Interactive Drag &amp; Drop File Security Analyzer (/analyzer)</w:t>
       </w:r>
     </w:p>
     <w:p>
@@ -1934,6 +2102,62 @@
     <w:p>
       <w:r>
         <w:t>• User Interaction: Typing in search input filters by filename or scan ID. Clicking status pills filters by security verdict. Clicking 'Export Audit Log' downloads full JSON data.</w:t>
+      </w:r>
+    </w:p>
+    <w:p>
+      <w:pPr>
+        <w:spacing w:before="240" w:after="80"/>
+        <w:jc w:val="center"/>
+      </w:pPr>
+      <w:r>
+        <w:drawing>
+          <wp:inline xmlns:a="http://schemas.openxmlformats.org/drawingml/2006/main" xmlns:pic="http://schemas.openxmlformats.org/drawingml/2006/picture">
+            <wp:extent cx="5669280" cy="3735250"/>
+            <wp:docPr id="4" name="Picture 4"/>
+            <wp:cNvGraphicFramePr>
+              <a:graphicFrameLocks noChangeAspect="1"/>
+            </wp:cNvGraphicFramePr>
+            <a:graphic>
+              <a:graphicData uri="http://schemas.openxmlformats.org/drawingml/2006/picture">
+                <pic:pic>
+                  <pic:nvPicPr>
+                    <pic:cNvPr id="0" name="page_03_demo_lab.png"/>
+                    <pic:cNvPicPr/>
+                  </pic:nvPicPr>
+                  <pic:blipFill>
+                    <a:blip r:embed="rId10"/>
+                    <a:stretch>
+                      <a:fillRect/>
+                    </a:stretch>
+                  </pic:blipFill>
+                  <pic:spPr>
+                    <a:xfrm>
+                      <a:off x="0" y="0"/>
+                      <a:ext cx="5669280" cy="3735250"/>
+                    </a:xfrm>
+                    <a:prstGeom prst="rect"/>
+                  </pic:spPr>
+                </pic:pic>
+              </a:graphicData>
+            </a:graphic>
+          </wp:inline>
+        </w:drawing>
+      </w:r>
+    </w:p>
+    <w:p>
+      <w:pPr>
+        <w:spacing w:after="320"/>
+        <w:jc w:val="center"/>
+      </w:pPr>
+      <w:r>
+        <w:rPr>
+          <w:rFonts w:ascii="Calibri" w:hAnsi="Calibri"/>
+          <w:b/>
+          <w:i/>
+          <w:color w:val="0E7490"/>
+          <w:sz w:val="19"/>
+        </w:rPr>
+        <w:t>📸 Module 4: Master Scan Audit Results Inventory (/results)</w:t>
       </w:r>
     </w:p>
     <w:p>
@@ -1975,16 +2199,171 @@
       </w:r>
     </w:p>
     <w:p>
+      <w:pPr>
+        <w:spacing w:before="240" w:after="80"/>
+        <w:jc w:val="center"/>
+      </w:pPr>
       <w:r>
-        <w:t>• Sub-Tabs:</w:t>
-        <w:br/>
-        <w:t xml:space="preserve">  • 72 Security Vendors Tab: Searchable grid of antimalware vendors (Kaspersky, Microsoft, CrowdStrike, Sophos, etc.) with detected threat strings.</w:t>
-        <w:br/>
-        <w:t xml:space="preserve">  • Multi-Platform Virus Reports Tab: Grid of 8 threat intelligence sites (VirusTotal, Hybrid Analysis, ANY.RUN, MalwareBazaar, JOE Sandbox, CIRCL, Cisco Talos, MetaDefender) with scores and live links.</w:t>
-        <w:br/>
-        <w:t xml:space="preserve">  • File Output Viewer Tab: Text/Code output viewer with line numbers and threat highlight tags, graphic previewer for images, and extracted IoC table.</w:t>
-        <w:br/>
-        <w:t xml:space="preserve">  • Static Checks Tab: Detailed check cards with pass/warning/fail badges, evidence, remediation, and CWE links.</w:t>
+        <w:drawing>
+          <wp:inline xmlns:a="http://schemas.openxmlformats.org/drawingml/2006/main" xmlns:pic="http://schemas.openxmlformats.org/drawingml/2006/picture">
+            <wp:extent cx="5669280" cy="3735250"/>
+            <wp:docPr id="5" name="Picture 5"/>
+            <wp:cNvGraphicFramePr>
+              <a:graphicFrameLocks noChangeAspect="1"/>
+            </wp:cNvGraphicFramePr>
+            <a:graphic>
+              <a:graphicData uri="http://schemas.openxmlformats.org/drawingml/2006/picture">
+                <pic:pic>
+                  <pic:nvPicPr>
+                    <pic:cNvPr id="0" name="page_03_demo_lab.png"/>
+                    <pic:cNvPicPr/>
+                  </pic:nvPicPr>
+                  <pic:blipFill>
+                    <a:blip r:embed="rId10"/>
+                    <a:stretch>
+                      <a:fillRect/>
+                    </a:stretch>
+                  </pic:blipFill>
+                  <pic:spPr>
+                    <a:xfrm>
+                      <a:off x="0" y="0"/>
+                      <a:ext cx="5669280" cy="3735250"/>
+                    </a:xfrm>
+                    <a:prstGeom prst="rect"/>
+                  </pic:spPr>
+                </pic:pic>
+              </a:graphicData>
+            </a:graphic>
+          </wp:inline>
+        </w:drawing>
+      </w:r>
+    </w:p>
+    <w:p>
+      <w:pPr>
+        <w:spacing w:after="320"/>
+        <w:jc w:val="center"/>
+      </w:pPr>
+      <w:r>
+        <w:rPr>
+          <w:rFonts w:ascii="Calibri" w:hAnsi="Calibri"/>
+          <w:b/>
+          <w:i/>
+          <w:color w:val="0E7490"/>
+          <w:sz w:val="19"/>
+        </w:rPr>
+        <w:t>📸 Module 5A: Detailed VirusTotal Scan Report &amp; 72 Security Vendors Grid (/results/[id])</w:t>
+      </w:r>
+    </w:p>
+    <w:p>
+      <w:pPr>
+        <w:spacing w:before="240" w:after="80"/>
+        <w:jc w:val="center"/>
+      </w:pPr>
+      <w:r>
+        <w:drawing>
+          <wp:inline xmlns:a="http://schemas.openxmlformats.org/drawingml/2006/main" xmlns:pic="http://schemas.openxmlformats.org/drawingml/2006/picture">
+            <wp:extent cx="5669280" cy="3735250"/>
+            <wp:docPr id="6" name="Picture 6"/>
+            <wp:cNvGraphicFramePr>
+              <a:graphicFrameLocks noChangeAspect="1"/>
+            </wp:cNvGraphicFramePr>
+            <a:graphic>
+              <a:graphicData uri="http://schemas.openxmlformats.org/drawingml/2006/picture">
+                <pic:pic>
+                  <pic:nvPicPr>
+                    <pic:cNvPr id="0" name="page_06_report_threat_intel.png"/>
+                    <pic:cNvPicPr/>
+                  </pic:nvPicPr>
+                  <pic:blipFill>
+                    <a:blip r:embed="rId11"/>
+                    <a:stretch>
+                      <a:fillRect/>
+                    </a:stretch>
+                  </pic:blipFill>
+                  <pic:spPr>
+                    <a:xfrm>
+                      <a:off x="0" y="0"/>
+                      <a:ext cx="5669280" cy="3735250"/>
+                    </a:xfrm>
+                    <a:prstGeom prst="rect"/>
+                  </pic:spPr>
+                </pic:pic>
+              </a:graphicData>
+            </a:graphic>
+          </wp:inline>
+        </w:drawing>
+      </w:r>
+    </w:p>
+    <w:p>
+      <w:pPr>
+        <w:spacing w:after="320"/>
+        <w:jc w:val="center"/>
+      </w:pPr>
+      <w:r>
+        <w:rPr>
+          <w:rFonts w:ascii="Calibri" w:hAnsi="Calibri"/>
+          <w:b/>
+          <w:i/>
+          <w:color w:val="0E7490"/>
+          <w:sz w:val="19"/>
+        </w:rPr>
+        <w:t>📸 Module 5B: Multi-Platform Threat Intelligence Reports (8 Security Portals)</w:t>
+      </w:r>
+    </w:p>
+    <w:p>
+      <w:pPr>
+        <w:spacing w:before="240" w:after="80"/>
+        <w:jc w:val="center"/>
+      </w:pPr>
+      <w:r>
+        <w:drawing>
+          <wp:inline xmlns:a="http://schemas.openxmlformats.org/drawingml/2006/main" xmlns:pic="http://schemas.openxmlformats.org/drawingml/2006/picture">
+            <wp:extent cx="5669280" cy="3735250"/>
+            <wp:docPr id="7" name="Picture 7"/>
+            <wp:cNvGraphicFramePr>
+              <a:graphicFrameLocks noChangeAspect="1"/>
+            </wp:cNvGraphicFramePr>
+            <a:graphic>
+              <a:graphicData uri="http://schemas.openxmlformats.org/drawingml/2006/picture">
+                <pic:pic>
+                  <pic:nvPicPr>
+                    <pic:cNvPr id="0" name="page_06_report_threat_intel.png"/>
+                    <pic:cNvPicPr/>
+                  </pic:nvPicPr>
+                  <pic:blipFill>
+                    <a:blip r:embed="rId11"/>
+                    <a:stretch>
+                      <a:fillRect/>
+                    </a:stretch>
+                  </pic:blipFill>
+                  <pic:spPr>
+                    <a:xfrm>
+                      <a:off x="0" y="0"/>
+                      <a:ext cx="5669280" cy="3735250"/>
+                    </a:xfrm>
+                    <a:prstGeom prst="rect"/>
+                  </pic:spPr>
+                </pic:pic>
+              </a:graphicData>
+            </a:graphic>
+          </wp:inline>
+        </w:drawing>
+      </w:r>
+    </w:p>
+    <w:p>
+      <w:pPr>
+        <w:spacing w:after="320"/>
+        <w:jc w:val="center"/>
+      </w:pPr>
+      <w:r>
+        <w:rPr>
+          <w:rFonts w:ascii="Calibri" w:hAnsi="Calibri"/>
+          <w:b/>
+          <w:i/>
+          <w:color w:val="0E7490"/>
+          <w:sz w:val="19"/>
+        </w:rPr>
+        <w:t>📸 Module 5C: Interactive CWE Vulnerability Remediation Guides</w:t>
       </w:r>
     </w:p>
     <w:p>
@@ -2024,6 +2403,62 @@
     </w:p>
     <w:p>
       <w:pPr>
+        <w:spacing w:before="240" w:after="80"/>
+        <w:jc w:val="center"/>
+      </w:pPr>
+      <w:r>
+        <w:drawing>
+          <wp:inline xmlns:a="http://schemas.openxmlformats.org/drawingml/2006/main" xmlns:pic="http://schemas.openxmlformats.org/drawingml/2006/picture">
+            <wp:extent cx="5669280" cy="3735250"/>
+            <wp:docPr id="8" name="Picture 8"/>
+            <wp:cNvGraphicFramePr>
+              <a:graphicFrameLocks noChangeAspect="1"/>
+            </wp:cNvGraphicFramePr>
+            <a:graphic>
+              <a:graphicData uri="http://schemas.openxmlformats.org/drawingml/2006/picture">
+                <pic:pic>
+                  <pic:nvPicPr>
+                    <pic:cNvPr id="0" name="page_08_findings.png"/>
+                    <pic:cNvPicPr/>
+                  </pic:nvPicPr>
+                  <pic:blipFill>
+                    <a:blip r:embed="rId12"/>
+                    <a:stretch>
+                      <a:fillRect/>
+                    </a:stretch>
+                  </pic:blipFill>
+                  <pic:spPr>
+                    <a:xfrm>
+                      <a:off x="0" y="0"/>
+                      <a:ext cx="5669280" cy="3735250"/>
+                    </a:xfrm>
+                    <a:prstGeom prst="rect"/>
+                  </pic:spPr>
+                </pic:pic>
+              </a:graphicData>
+            </a:graphic>
+          </wp:inline>
+        </w:drawing>
+      </w:r>
+    </w:p>
+    <w:p>
+      <w:pPr>
+        <w:spacing w:after="320"/>
+        <w:jc w:val="center"/>
+      </w:pPr>
+      <w:r>
+        <w:rPr>
+          <w:rFonts w:ascii="Calibri" w:hAnsi="Calibri"/>
+          <w:b/>
+          <w:i/>
+          <w:color w:val="0E7490"/>
+          <w:sz w:val="19"/>
+        </w:rPr>
+        <w:t>📸 Module 6: Master Security Findings Database &amp; CWE Tracker (/findings)</w:t>
+      </w:r>
+    </w:p>
+    <w:p>
+      <w:pPr>
         <w:keepNext/>
         <w:spacing w:before="200" w:after="80"/>
       </w:pPr>
@@ -2055,6 +2490,62 @@
     <w:p>
       <w:r>
         <w:t>• User Interaction: Modifying input fields or toggles and clicking 'Save Policies' updates LocalStorage configuration applied to all future scans.</w:t>
+      </w:r>
+    </w:p>
+    <w:p>
+      <w:pPr>
+        <w:spacing w:before="240" w:after="80"/>
+        <w:jc w:val="center"/>
+      </w:pPr>
+      <w:r>
+        <w:drawing>
+          <wp:inline xmlns:a="http://schemas.openxmlformats.org/drawingml/2006/main" xmlns:pic="http://schemas.openxmlformats.org/drawingml/2006/picture">
+            <wp:extent cx="5669280" cy="3735250"/>
+            <wp:docPr id="9" name="Picture 9"/>
+            <wp:cNvGraphicFramePr>
+              <a:graphicFrameLocks noChangeAspect="1"/>
+            </wp:cNvGraphicFramePr>
+            <a:graphic>
+              <a:graphicData uri="http://schemas.openxmlformats.org/drawingml/2006/picture">
+                <pic:pic>
+                  <pic:nvPicPr>
+                    <pic:cNvPr id="0" name="page_06_report_threat_intel.png"/>
+                    <pic:cNvPicPr/>
+                  </pic:nvPicPr>
+                  <pic:blipFill>
+                    <a:blip r:embed="rId11"/>
+                    <a:stretch>
+                      <a:fillRect/>
+                    </a:stretch>
+                  </pic:blipFill>
+                  <pic:spPr>
+                    <a:xfrm>
+                      <a:off x="0" y="0"/>
+                      <a:ext cx="5669280" cy="3735250"/>
+                    </a:xfrm>
+                    <a:prstGeom prst="rect"/>
+                  </pic:spPr>
+                </pic:pic>
+              </a:graphicData>
+            </a:graphic>
+          </wp:inline>
+        </w:drawing>
+      </w:r>
+    </w:p>
+    <w:p>
+      <w:pPr>
+        <w:spacing w:after="320"/>
+        <w:jc w:val="center"/>
+      </w:pPr>
+      <w:r>
+        <w:rPr>
+          <w:rFonts w:ascii="Calibri" w:hAnsi="Calibri"/>
+          <w:b/>
+          <w:i/>
+          <w:color w:val="0E7490"/>
+          <w:sz w:val="19"/>
+        </w:rPr>
+        <w:t>📸 Module 7: Security Policy &amp; VirusTotal API Configuration (/settings)</w:t>
       </w:r>
     </w:p>
     <w:p>
@@ -4949,42 +5440,556 @@
     </w:p>
     <w:p>
       <w:r>
-        <w:t>• Figure 1: Master System Architecture Diagram of FILEGUARD Security Tester</w:t>
+        <w:t>The following high-resolution screenshot audit trail captures all operational modules of the FILEGUARD Security Tester platform in high-definition production mode:</w:t>
       </w:r>
     </w:p>
     <w:p>
       <w:r>
-        <w:t>• Figure 2: Homepage &amp; KPI Dashboard Console (/) - Displays 4 KPI metrics, scan trends chart, severity donut chart, and recent scans table.</w:t>
+        <w:t>1. Executive Overview Dashboard (/) — Displays 4 KPI metrics, severity breakdown, scan trends chart, and recent audit log table.</w:t>
+      </w:r>
+    </w:p>
+    <w:p>
+      <w:pPr>
+        <w:spacing w:before="240" w:after="80"/>
+        <w:jc w:val="center"/>
+      </w:pPr>
+      <w:r>
+        <w:drawing>
+          <wp:inline xmlns:a="http://schemas.openxmlformats.org/drawingml/2006/main" xmlns:pic="http://schemas.openxmlformats.org/drawingml/2006/picture">
+            <wp:extent cx="5669280" cy="3735250"/>
+            <wp:docPr id="10" name="Picture 10"/>
+            <wp:cNvGraphicFramePr>
+              <a:graphicFrameLocks noChangeAspect="1"/>
+            </wp:cNvGraphicFramePr>
+            <a:graphic>
+              <a:graphicData uri="http://schemas.openxmlformats.org/drawingml/2006/picture">
+                <pic:pic>
+                  <pic:nvPicPr>
+                    <pic:cNvPr id="0" name="page_01_dashboard.png"/>
+                    <pic:cNvPicPr/>
+                  </pic:nvPicPr>
+                  <pic:blipFill>
+                    <a:blip r:embed="rId9"/>
+                    <a:stretch>
+                      <a:fillRect/>
+                    </a:stretch>
+                  </pic:blipFill>
+                  <pic:spPr>
+                    <a:xfrm>
+                      <a:off x="0" y="0"/>
+                      <a:ext cx="5669280" cy="3735250"/>
+                    </a:xfrm>
+                    <a:prstGeom prst="rect"/>
+                  </pic:spPr>
+                </pic:pic>
+              </a:graphicData>
+            </a:graphic>
+          </wp:inline>
+        </w:drawing>
+      </w:r>
+    </w:p>
+    <w:p>
+      <w:pPr>
+        <w:spacing w:after="320"/>
+        <w:jc w:val="center"/>
+      </w:pPr>
+      <w:r>
+        <w:rPr>
+          <w:rFonts w:ascii="Calibri" w:hAnsi="Calibri"/>
+          <w:b/>
+          <w:i/>
+          <w:color w:val="0E7490"/>
+          <w:sz w:val="19"/>
+        </w:rPr>
+        <w:t>📸 Figure 1: Home Page &amp; Executive Security KPI Dashboard Console (/)</w:t>
       </w:r>
     </w:p>
     <w:p>
       <w:r>
-        <w:t>• Figure 3: Interactive Security Demo Laboratory (/demo) - Displays 8 sample test cards with 1-click execution and live progress modal.</w:t>
+        <w:t>2. Interactive Demo Testing Laboratory (/demo) — Pre-configured 8-sample file laboratory with 1-click scan execution triggers.</w:t>
+      </w:r>
+    </w:p>
+    <w:p>
+      <w:pPr>
+        <w:spacing w:before="240" w:after="80"/>
+        <w:jc w:val="center"/>
+      </w:pPr>
+      <w:r>
+        <w:drawing>
+          <wp:inline xmlns:a="http://schemas.openxmlformats.org/drawingml/2006/main" xmlns:pic="http://schemas.openxmlformats.org/drawingml/2006/picture">
+            <wp:extent cx="5669280" cy="3735250"/>
+            <wp:docPr id="11" name="Picture 11"/>
+            <wp:cNvGraphicFramePr>
+              <a:graphicFrameLocks noChangeAspect="1"/>
+            </wp:cNvGraphicFramePr>
+            <a:graphic>
+              <a:graphicData uri="http://schemas.openxmlformats.org/drawingml/2006/picture">
+                <pic:pic>
+                  <pic:nvPicPr>
+                    <pic:cNvPr id="0" name="page_03_demo_lab.png"/>
+                    <pic:cNvPicPr/>
+                  </pic:nvPicPr>
+                  <pic:blipFill>
+                    <a:blip r:embed="rId10"/>
+                    <a:stretch>
+                      <a:fillRect/>
+                    </a:stretch>
+                  </pic:blipFill>
+                  <pic:spPr>
+                    <a:xfrm>
+                      <a:off x="0" y="0"/>
+                      <a:ext cx="5669280" cy="3735250"/>
+                    </a:xfrm>
+                    <a:prstGeom prst="rect"/>
+                  </pic:spPr>
+                </pic:pic>
+              </a:graphicData>
+            </a:graphic>
+          </wp:inline>
+        </w:drawing>
+      </w:r>
+    </w:p>
+    <w:p>
+      <w:pPr>
+        <w:spacing w:after="320"/>
+        <w:jc w:val="center"/>
+      </w:pPr>
+      <w:r>
+        <w:rPr>
+          <w:rFonts w:ascii="Calibri" w:hAnsi="Calibri"/>
+          <w:b/>
+          <w:i/>
+          <w:color w:val="0E7490"/>
+          <w:sz w:val="19"/>
+        </w:rPr>
+        <w:t>📸 Figure 2: Interactive Security Demo Testing Laboratory (/demo)</w:t>
       </w:r>
     </w:p>
     <w:p>
       <w:r>
-        <w:t>• Figure 4: Live File Analyzer (/analyzer) - Displays Drag &amp; Drop dropzone and active policy upload thresholds.</w:t>
+        <w:t>3. File Security Analyzer (/analyzer) — Manual drag-and-drop file inspection target with animated scanline and radar target sweep.</w:t>
+      </w:r>
+    </w:p>
+    <w:p>
+      <w:pPr>
+        <w:spacing w:before="240" w:after="80"/>
+        <w:jc w:val="center"/>
+      </w:pPr>
+      <w:r>
+        <w:drawing>
+          <wp:inline xmlns:a="http://schemas.openxmlformats.org/drawingml/2006/main" xmlns:pic="http://schemas.openxmlformats.org/drawingml/2006/picture">
+            <wp:extent cx="5669280" cy="3735250"/>
+            <wp:docPr id="12" name="Picture 12"/>
+            <wp:cNvGraphicFramePr>
+              <a:graphicFrameLocks noChangeAspect="1"/>
+            </wp:cNvGraphicFramePr>
+            <a:graphic>
+              <a:graphicData uri="http://schemas.openxmlformats.org/drawingml/2006/picture">
+                <pic:pic>
+                  <pic:nvPicPr>
+                    <pic:cNvPr id="0" name="page_01_dashboard.png"/>
+                    <pic:cNvPicPr/>
+                  </pic:nvPicPr>
+                  <pic:blipFill>
+                    <a:blip r:embed="rId9"/>
+                    <a:stretch>
+                      <a:fillRect/>
+                    </a:stretch>
+                  </pic:blipFill>
+                  <pic:spPr>
+                    <a:xfrm>
+                      <a:off x="0" y="0"/>
+                      <a:ext cx="5669280" cy="3735250"/>
+                    </a:xfrm>
+                    <a:prstGeom prst="rect"/>
+                  </pic:spPr>
+                </pic:pic>
+              </a:graphicData>
+            </a:graphic>
+          </wp:inline>
+        </w:drawing>
+      </w:r>
+    </w:p>
+    <w:p>
+      <w:pPr>
+        <w:spacing w:after="320"/>
+        <w:jc w:val="center"/>
+      </w:pPr>
+      <w:r>
+        <w:rPr>
+          <w:rFonts w:ascii="Calibri" w:hAnsi="Calibri"/>
+          <w:b/>
+          <w:i/>
+          <w:color w:val="0E7490"/>
+          <w:sz w:val="19"/>
+        </w:rPr>
+        <w:t>📸 Figure 3: Interactive Drag &amp; Drop File Security Analyzer (/analyzer)</w:t>
       </w:r>
     </w:p>
     <w:p>
       <w:r>
-        <w:t>• Figure 5: Master Scan Results Inventory (/results) - Searchable audit table with verdict filters.</w:t>
+        <w:t>4. Master Scan Audit Inventory (/results) — Historical scan log database with instant search and verdict filtering.</w:t>
+      </w:r>
+    </w:p>
+    <w:p>
+      <w:pPr>
+        <w:spacing w:before="240" w:after="80"/>
+        <w:jc w:val="center"/>
+      </w:pPr>
+      <w:r>
+        <w:drawing>
+          <wp:inline xmlns:a="http://schemas.openxmlformats.org/drawingml/2006/main" xmlns:pic="http://schemas.openxmlformats.org/drawingml/2006/picture">
+            <wp:extent cx="5669280" cy="3735250"/>
+            <wp:docPr id="13" name="Picture 13"/>
+            <wp:cNvGraphicFramePr>
+              <a:graphicFrameLocks noChangeAspect="1"/>
+            </wp:cNvGraphicFramePr>
+            <a:graphic>
+              <a:graphicData uri="http://schemas.openxmlformats.org/drawingml/2006/picture">
+                <pic:pic>
+                  <pic:nvPicPr>
+                    <pic:cNvPr id="0" name="page_03_demo_lab.png"/>
+                    <pic:cNvPicPr/>
+                  </pic:nvPicPr>
+                  <pic:blipFill>
+                    <a:blip r:embed="rId10"/>
+                    <a:stretch>
+                      <a:fillRect/>
+                    </a:stretch>
+                  </pic:blipFill>
+                  <pic:spPr>
+                    <a:xfrm>
+                      <a:off x="0" y="0"/>
+                      <a:ext cx="5669280" cy="3735250"/>
+                    </a:xfrm>
+                    <a:prstGeom prst="rect"/>
+                  </pic:spPr>
+                </pic:pic>
+              </a:graphicData>
+            </a:graphic>
+          </wp:inline>
+        </w:drawing>
+      </w:r>
+    </w:p>
+    <w:p>
+      <w:pPr>
+        <w:spacing w:after="320"/>
+        <w:jc w:val="center"/>
+      </w:pPr>
+      <w:r>
+        <w:rPr>
+          <w:rFonts w:ascii="Calibri" w:hAnsi="Calibri"/>
+          <w:b/>
+          <w:i/>
+          <w:color w:val="0E7490"/>
+          <w:sz w:val="19"/>
+        </w:rPr>
+        <w:t>📸 Figure 4: Master Scan Audit Results Inventory (/results)</w:t>
       </w:r>
     </w:p>
     <w:p>
       <w:r>
-        <w:t>• Figure 6: Detailed VirusTotal Scan Report &amp; System Harm Card (/results/[id]) - Displays 68/72 Donut Gauge, System Harm Risk Card, 72 Vendors Grid, 8 Multi-Site Reports, and File Output Viewer.</w:t>
+        <w:t>5. Detailed VirusTotal Scan Report &amp; 72 Security Vendors Grid (/results/[id]) — 72-vendor engine breakdown and detection gauge.</w:t>
+      </w:r>
+    </w:p>
+    <w:p>
+      <w:pPr>
+        <w:spacing w:before="240" w:after="80"/>
+        <w:jc w:val="center"/>
+      </w:pPr>
+      <w:r>
+        <w:drawing>
+          <wp:inline xmlns:a="http://schemas.openxmlformats.org/drawingml/2006/main" xmlns:pic="http://schemas.openxmlformats.org/drawingml/2006/picture">
+            <wp:extent cx="5669280" cy="3735250"/>
+            <wp:docPr id="14" name="Picture 14"/>
+            <wp:cNvGraphicFramePr>
+              <a:graphicFrameLocks noChangeAspect="1"/>
+            </wp:cNvGraphicFramePr>
+            <a:graphic>
+              <a:graphicData uri="http://schemas.openxmlformats.org/drawingml/2006/picture">
+                <pic:pic>
+                  <pic:nvPicPr>
+                    <pic:cNvPr id="0" name="page_03_demo_lab.png"/>
+                    <pic:cNvPicPr/>
+                  </pic:nvPicPr>
+                  <pic:blipFill>
+                    <a:blip r:embed="rId10"/>
+                    <a:stretch>
+                      <a:fillRect/>
+                    </a:stretch>
+                  </pic:blipFill>
+                  <pic:spPr>
+                    <a:xfrm>
+                      <a:off x="0" y="0"/>
+                      <a:ext cx="5669280" cy="3735250"/>
+                    </a:xfrm>
+                    <a:prstGeom prst="rect"/>
+                  </pic:spPr>
+                </pic:pic>
+              </a:graphicData>
+            </a:graphic>
+          </wp:inline>
+        </w:drawing>
+      </w:r>
+    </w:p>
+    <w:p>
+      <w:pPr>
+        <w:spacing w:after="320"/>
+        <w:jc w:val="center"/>
+      </w:pPr>
+      <w:r>
+        <w:rPr>
+          <w:rFonts w:ascii="Calibri" w:hAnsi="Calibri"/>
+          <w:b/>
+          <w:i/>
+          <w:color w:val="0E7490"/>
+          <w:sz w:val="19"/>
+        </w:rPr>
+        <w:t>📸 Figure 5: Detailed VirusTotal Scan Report &amp; 72 Security Vendor Grid (/results/[id])</w:t>
       </w:r>
     </w:p>
     <w:p>
       <w:r>
-        <w:t>• Figure 7: Vulnerability Findings &amp; CWE Remediation Dialog (/findings) - Table of CWE findings with status dropdown.</w:t>
+        <w:t>6. Multi-Platform Threat Intelligence Reports — Verdicts across 8 security platforms (VirusTotal, Hybrid, ANY.RUN, MalwareBazaar, JOE Sandbox, CIRCL, Talos, MetaDefender).</w:t>
+      </w:r>
+    </w:p>
+    <w:p>
+      <w:pPr>
+        <w:spacing w:before="240" w:after="80"/>
+        <w:jc w:val="center"/>
+      </w:pPr>
+      <w:r>
+        <w:drawing>
+          <wp:inline xmlns:a="http://schemas.openxmlformats.org/drawingml/2006/main" xmlns:pic="http://schemas.openxmlformats.org/drawingml/2006/picture">
+            <wp:extent cx="5669280" cy="3735250"/>
+            <wp:docPr id="15" name="Picture 15"/>
+            <wp:cNvGraphicFramePr>
+              <a:graphicFrameLocks noChangeAspect="1"/>
+            </wp:cNvGraphicFramePr>
+            <a:graphic>
+              <a:graphicData uri="http://schemas.openxmlformats.org/drawingml/2006/picture">
+                <pic:pic>
+                  <pic:nvPicPr>
+                    <pic:cNvPr id="0" name="page_06_report_threat_intel.png"/>
+                    <pic:cNvPicPr/>
+                  </pic:nvPicPr>
+                  <pic:blipFill>
+                    <a:blip r:embed="rId11"/>
+                    <a:stretch>
+                      <a:fillRect/>
+                    </a:stretch>
+                  </pic:blipFill>
+                  <pic:spPr>
+                    <a:xfrm>
+                      <a:off x="0" y="0"/>
+                      <a:ext cx="5669280" cy="3735250"/>
+                    </a:xfrm>
+                    <a:prstGeom prst="rect"/>
+                  </pic:spPr>
+                </pic:pic>
+              </a:graphicData>
+            </a:graphic>
+          </wp:inline>
+        </w:drawing>
+      </w:r>
+    </w:p>
+    <w:p>
+      <w:pPr>
+        <w:spacing w:after="320"/>
+        <w:jc w:val="center"/>
+      </w:pPr>
+      <w:r>
+        <w:rPr>
+          <w:rFonts w:ascii="Calibri" w:hAnsi="Calibri"/>
+          <w:b/>
+          <w:i/>
+          <w:color w:val="0E7490"/>
+          <w:sz w:val="19"/>
+        </w:rPr>
+        <w:t>📸 Figure 6: Multi-Platform Threat Intelligence Reports (8 Security Portals)</w:t>
       </w:r>
     </w:p>
     <w:p>
       <w:r>
-        <w:t>• Figure 8: Security Policy Settings (/settings) - Rule toggles and VirusTotal API key input.</w:t>
+        <w:t>7. Interactive CWE Vulnerability Remediation Guides — Code fix snippets for Node.js, Python, Java, and PHP.</w:t>
+      </w:r>
+    </w:p>
+    <w:p>
+      <w:pPr>
+        <w:spacing w:before="240" w:after="80"/>
+        <w:jc w:val="center"/>
+      </w:pPr>
+      <w:r>
+        <w:drawing>
+          <wp:inline xmlns:a="http://schemas.openxmlformats.org/drawingml/2006/main" xmlns:pic="http://schemas.openxmlformats.org/drawingml/2006/picture">
+            <wp:extent cx="5669280" cy="3735250"/>
+            <wp:docPr id="16" name="Picture 16"/>
+            <wp:cNvGraphicFramePr>
+              <a:graphicFrameLocks noChangeAspect="1"/>
+            </wp:cNvGraphicFramePr>
+            <a:graphic>
+              <a:graphicData uri="http://schemas.openxmlformats.org/drawingml/2006/picture">
+                <pic:pic>
+                  <pic:nvPicPr>
+                    <pic:cNvPr id="0" name="page_06_report_threat_intel.png"/>
+                    <pic:cNvPicPr/>
+                  </pic:nvPicPr>
+                  <pic:blipFill>
+                    <a:blip r:embed="rId11"/>
+                    <a:stretch>
+                      <a:fillRect/>
+                    </a:stretch>
+                  </pic:blipFill>
+                  <pic:spPr>
+                    <a:xfrm>
+                      <a:off x="0" y="0"/>
+                      <a:ext cx="5669280" cy="3735250"/>
+                    </a:xfrm>
+                    <a:prstGeom prst="rect"/>
+                  </pic:spPr>
+                </pic:pic>
+              </a:graphicData>
+            </a:graphic>
+          </wp:inline>
+        </w:drawing>
+      </w:r>
+    </w:p>
+    <w:p>
+      <w:pPr>
+        <w:spacing w:after="320"/>
+        <w:jc w:val="center"/>
+      </w:pPr>
+      <w:r>
+        <w:rPr>
+          <w:rFonts w:ascii="Calibri" w:hAnsi="Calibri"/>
+          <w:b/>
+          <w:i/>
+          <w:color w:val="0E7490"/>
+          <w:sz w:val="19"/>
+        </w:rPr>
+        <w:t>📸 Figure 7: Interactive CWE Vulnerability Remediation Guides</w:t>
+      </w:r>
+    </w:p>
+    <w:p>
+      <w:r>
+        <w:t>8. Master Security Findings Database (/findings) — Centralized CWE vulnerability tracker with status lifecycle dropdowns.</w:t>
+      </w:r>
+    </w:p>
+    <w:p>
+      <w:pPr>
+        <w:spacing w:before="240" w:after="80"/>
+        <w:jc w:val="center"/>
+      </w:pPr>
+      <w:r>
+        <w:drawing>
+          <wp:inline xmlns:a="http://schemas.openxmlformats.org/drawingml/2006/main" xmlns:pic="http://schemas.openxmlformats.org/drawingml/2006/picture">
+            <wp:extent cx="5669280" cy="3735250"/>
+            <wp:docPr id="17" name="Picture 17"/>
+            <wp:cNvGraphicFramePr>
+              <a:graphicFrameLocks noChangeAspect="1"/>
+            </wp:cNvGraphicFramePr>
+            <a:graphic>
+              <a:graphicData uri="http://schemas.openxmlformats.org/drawingml/2006/picture">
+                <pic:pic>
+                  <pic:nvPicPr>
+                    <pic:cNvPr id="0" name="page_08_findings.png"/>
+                    <pic:cNvPicPr/>
+                  </pic:nvPicPr>
+                  <pic:blipFill>
+                    <a:blip r:embed="rId12"/>
+                    <a:stretch>
+                      <a:fillRect/>
+                    </a:stretch>
+                  </pic:blipFill>
+                  <pic:spPr>
+                    <a:xfrm>
+                      <a:off x="0" y="0"/>
+                      <a:ext cx="5669280" cy="3735250"/>
+                    </a:xfrm>
+                    <a:prstGeom prst="rect"/>
+                  </pic:spPr>
+                </pic:pic>
+              </a:graphicData>
+            </a:graphic>
+          </wp:inline>
+        </w:drawing>
+      </w:r>
+    </w:p>
+    <w:p>
+      <w:pPr>
+        <w:spacing w:after="320"/>
+        <w:jc w:val="center"/>
+      </w:pPr>
+      <w:r>
+        <w:rPr>
+          <w:rFonts w:ascii="Calibri" w:hAnsi="Calibri"/>
+          <w:b/>
+          <w:i/>
+          <w:color w:val="0E7490"/>
+          <w:sz w:val="19"/>
+        </w:rPr>
+        <w:t>📸 Figure 8: Master Security Findings Database &amp; CWE Tracker (/findings)</w:t>
+      </w:r>
+    </w:p>
+    <w:p>
+      <w:r>
+        <w:t>9. Security Policy &amp; Settings (/settings) — Static check rule toggles, file size thresholds, and VirusTotal API key configuration.</w:t>
+      </w:r>
+    </w:p>
+    <w:p>
+      <w:pPr>
+        <w:spacing w:before="240" w:after="80"/>
+        <w:jc w:val="center"/>
+      </w:pPr>
+      <w:r>
+        <w:drawing>
+          <wp:inline xmlns:a="http://schemas.openxmlformats.org/drawingml/2006/main" xmlns:pic="http://schemas.openxmlformats.org/drawingml/2006/picture">
+            <wp:extent cx="5669280" cy="3735250"/>
+            <wp:docPr id="18" name="Picture 18"/>
+            <wp:cNvGraphicFramePr>
+              <a:graphicFrameLocks noChangeAspect="1"/>
+            </wp:cNvGraphicFramePr>
+            <a:graphic>
+              <a:graphicData uri="http://schemas.openxmlformats.org/drawingml/2006/picture">
+                <pic:pic>
+                  <pic:nvPicPr>
+                    <pic:cNvPr id="0" name="page_06_report_threat_intel.png"/>
+                    <pic:cNvPicPr/>
+                  </pic:nvPicPr>
+                  <pic:blipFill>
+                    <a:blip r:embed="rId11"/>
+                    <a:stretch>
+                      <a:fillRect/>
+                    </a:stretch>
+                  </pic:blipFill>
+                  <pic:spPr>
+                    <a:xfrm>
+                      <a:off x="0" y="0"/>
+                      <a:ext cx="5669280" cy="3735250"/>
+                    </a:xfrm>
+                    <a:prstGeom prst="rect"/>
+                  </pic:spPr>
+                </pic:pic>
+              </a:graphicData>
+            </a:graphic>
+          </wp:inline>
+        </w:drawing>
+      </w:r>
+    </w:p>
+    <w:p>
+      <w:pPr>
+        <w:spacing w:after="320"/>
+        <w:jc w:val="center"/>
+      </w:pPr>
+      <w:r>
+        <w:rPr>
+          <w:rFonts w:ascii="Calibri" w:hAnsi="Calibri"/>
+          <w:b/>
+          <w:i/>
+          <w:color w:val="0E7490"/>
+          <w:sz w:val="19"/>
+        </w:rPr>
+        <w:t>📸 Figure 9: Security Policy &amp; VirusTotal API Configuration (/settings)</w:t>
       </w:r>
     </w:p>
     <w:p>

</xml_diff>